<commit_message>
Regenerate PDFs and ZIPs with new contact email
</commit_message>
<xml_diff>
--- a/private-7f3a9b2c8e/docs/fin-model.docx
+++ b/private-7f3a9b2c8e/docs/fin-model.docx
@@ -35,7 +35,7 @@
         <w:t xml:space="preserve"> </w:t>
       </w:r>
       <w:r>
-        <w:t xml:space="preserve">Аслан КАА (idriskaaa@gmail.com · aslankaa.com)</w:t>
+        <w:t xml:space="preserve">Аслан КАА (aslankaa@yandex.ru · aslankaa.com)</w:t>
       </w:r>
       <w:r>
         <w:t xml:space="preserve"> </w:t>
@@ -6566,7 +6566,7 @@
         <w:pStyle w:val="BodyText"/>
       </w:pPr>
       <w:r>
-        <w:t xml:space="preserve">Заказчик: Аслан КАА · idriskaaa@gmail.com · aslankaa.com</w:t>
+        <w:t xml:space="preserve">Заказчик: Аслан КАА · aslankaa@yandex.ru · aslankaa.com</w:t>
       </w:r>
     </w:p>
     <w:bookmarkEnd w:id="40"/>

</xml_diff>